<commit_message>
Switch CC/CL prompt to raw audio input, tighten transcript instructions
- The prompt (and its UI intro text / reference copies) now asks the
  user to hand the AI the recorded audio file directly instead of a
  separately-transcribed text blob, since that extra manual
  transcription step wasn't actually necessary.
- Instruction 3 now asks for third-party-readable wording with verbal
  fillers ("ええと", "その") stripped out, rather than a verbatim
  transcript.
- New instruction 5: keep personal information such as names out of
  the output, using only "CC"/"CL".
</commit_message>
<xml_diff>
--- a/reference/面談記録_整理用サンプル.docx
+++ b/reference/面談記録_整理用サンプル.docx
@@ -15,7 +15,7 @@
         <w:pStyle w:val="Note"/>
       </w:pPr>
       <w:r>
-        <w:t xml:space="preserve">※本ファイルはcareer-mendan-assistの録音データ等を文字起こしした後、CC（キャリアコンサルタント）/CL（相談者）発言を1分刻みで整理する際の書式サンプルです。同梱のプロンプトをAIに渡し、出力されたMarkdown表の内容をこの書式に貼り替えてご利用ください。</w:t>
+        <w:t xml:space="preserve">※本ファイルはcareer-mendan-assistで録音した音声ファイルを、CC（キャリアコンサルタント）/CL（相談者）発言を1分刻みで整理する際の書式サンプルです。同梱のプロンプトと音声ファイルをAIに渡し、出力されたMarkdown表の内容をこの書式に貼り替えてご利用ください。</w:t>
       </w:r>
     </w:p>
     <w:p>
@@ -317,7 +317,7 @@
           </w:tcPr>
           <w:p>
             <w:r>
-              <w:t xml:space="preserve">（以降、実際の文字起こし内容に置き換えてご利用ください）</w:t>
+              <w:t xml:space="preserve">（以降、実際のAI出力内容に置き換えてご利用ください）</w:t>
             </w:r>
           </w:p>
         </w:tc>

</xml_diff>